<commit_message>
Update WBS (OpenCode) and RACI (add Ali, redistribute A, red R/A, add C)
</commit_message>
<xml_diff>
--- a/00_GESTION_DE_PROJET/01_Cadrage/WBS.docx
+++ b/00_GESTION_DE_PROJET/01_Cadrage/WBS.docx
@@ -1614,7 +1614,7 @@
                 <w:bCs w:val="1"/>
                 <w:rtl w:val="0"/>
               </w:rPr>
-              <w:t xml:space="preserve">IA de Lecture</w:t>
+              <w:t>IA via OpenCode — Choix du modèle/provider</w:t>
             </w:r>
             <w:r>
               <w:rPr>
@@ -1633,7 +1633,7 @@
         <w:rPr>
           <w:rtl w:val="0"/>
         </w:rPr>
-        <w:t xml:space="preserve">L'objectif est de transformer un flux HTML complexe et désordonné en un fichier JSON structuré et propre grâce à un modèle de langage local.</w:t>
+        <w:t>L'objectif est d'utiliser l'agent IA OpenCode pour structurer les données HTML extraites en JSON, sans développer notre propre modèle LLM.opre grâce à un modèle de langage local.</w:t>
       </w:r>
     </w:p>
     <w:p>
@@ -1661,7 +1661,7 @@
           <w:szCs w:val="22"/>
           <w:rtl w:val="0"/>
         </w:rPr>
-        <w:t xml:space="preserve">T2.0 : [FORMATION] IA</w:t>
+        <w:t>T2.0 : [FORMATION] OpenCode &amp; IA</w:t>
       </w:r>
     </w:p>
     <w:p>
@@ -1713,7 +1713,7 @@
           <w:szCs w:val="22"/>
           <w:rtl w:val="0"/>
         </w:rPr>
-        <w:t xml:space="preserve">T2.1 : Sélection et Benchmark de l'IA</w:t>
+        <w:t>T2.1 : Sélection du modèle/provider pour OpenCode</w:t>
       </w:r>
     </w:p>
     <w:p>
@@ -1885,7 +1885,7 @@
           <w:szCs w:val="22"/>
           <w:rtl w:val="0"/>
         </w:rPr>
-        <w:t xml:space="preserve">T2.2 : Description des paramètres de sortie</w:t>
+        <w:t>T2.2 : Définition du schéma de sortie</w:t>
       </w:r>
     </w:p>
     <w:p>
@@ -1985,7 +1985,7 @@
           <w:szCs w:val="22"/>
           <w:rtl w:val="0"/>
         </w:rPr>
-        <w:t xml:space="preserve">T2.3 : Préparation du dataset</w:t>
+        <w:t>T2.3 : Préparation des exemples (dataset de test)</w:t>
       </w:r>
     </w:p>
     <w:p>
@@ -2085,7 +2085,7 @@
           <w:szCs w:val="22"/>
           <w:rtl w:val="0"/>
         </w:rPr>
-        <w:t xml:space="preserve">T2.4 : Entraînement de l'IA (Prompting)</w:t>
+        <w:t>T2.4 : Configuration d'OpenCode &amp; Prompting</w:t>
       </w:r>
     </w:p>
     <w:p>
@@ -2185,7 +2185,7 @@
           <w:szCs w:val="22"/>
           <w:rtl w:val="0"/>
         </w:rPr>
-        <w:t xml:space="preserve">T2.5 : Processus de validation</w:t>
+        <w:t>T2.5 : Validation de la solution choisie</w:t>
       </w:r>
     </w:p>
     <w:p>
@@ -3045,7 +3045,7 @@
         <w:rPr>
           <w:rtl w:val="0"/>
         </w:rPr>
-        <w:t xml:space="preserve">L'objectif est de créer une boucle de rétroaction où l'IA répare en temps réel les erreurs du scraper en générant de nouveaux sélecteurs (CSS/XPath) sans intervention humaine.</w:t>
+        <w:t>L'objectif est de créer une boucle de rétroaction où OpenCode (via son agent IA) répare en temps réel les erreurs du scraper, en s'appuyant sur le modèle/provider sélectionné en phase T2.r en générant de nouveaux sélecteurs (CSS/XPath) sans intervention humaine.</w:t>
       </w:r>
     </w:p>
     <w:p>

</xml_diff>

<commit_message>
Projet G1 G2 - mise à jour globale
</commit_message>
<xml_diff>
--- a/00_GESTION_DE_PROJET/01_Cadrage/WBS.docx
+++ b/00_GESTION_DE_PROJET/01_Cadrage/WBS.docx
@@ -154,17 +154,53 @@
           <w:b/>
           <w:bCs/>
         </w:rPr>
-        <w:t xml:space="preserve">T0.1.1 : Étude de la jurisprudence du Web </w:t>
+        <w:t>T0.1.1 : Étude de la jurisprudence du Web Scraping</w:t>
+      </w:r>
+    </w:p>
+    <w:p>
+      <w:pPr>
+        <w:numPr>
+          <w:ilvl w:val="0"/>
+          <w:numId w:val="4"/>
+        </w:numPr>
+        <w:spacing w:before="240"/>
+      </w:pPr>
+      <w:r>
+        <w:rPr>
+          <w:b/>
+          <w:bCs/>
+        </w:rPr>
+        <w:t>Recherche sur le RGPD :</w:t>
+      </w:r>
+      <w:r>
+        <w:t xml:space="preserve"> Analyser la distinction entre données publiques d'entreprises (SIREN, CA) et données personnelles (noms de dirigeants, emails directs) pour rester conforme au Règlement Général sur la Protection des Données.</w:t>
+      </w:r>
+    </w:p>
+    <w:p>
+      <w:pPr>
+        <w:numPr>
+          <w:ilvl w:val="0"/>
+          <w:numId w:val="4"/>
+        </w:numPr>
+      </w:pPr>
+      <w:r>
+        <w:rPr>
+          <w:b/>
+          <w:bCs/>
+        </w:rPr>
+        <w:t>Droit d'auteur et droit des bases de données :</w:t>
+      </w:r>
+      <w:r>
+        <w:t xml:space="preserve"> Étudier la notion </w:t>
       </w:r>
       <w:proofErr w:type="spellStart"/>
       <w:r>
-        <w:rPr>
-          <w:b/>
-          <w:bCs/>
-        </w:rPr>
-        <w:t>Scraping</w:t>
+        <w:t>d"extraction</w:t>
       </w:r>
       <w:proofErr w:type="spellEnd"/>
+      <w:r>
+        <w:t xml:space="preserve"> substantielle" pour éviter de porter atteinte aux droits de propriété des propriétaires de sites.</w:t>
+      </w:r>
     </w:p>
     <w:p>
       <w:pPr>
@@ -172,6 +208,73 @@
           <w:ilvl w:val="0"/>
           <w:numId w:val="4"/>
         </w:numPr>
+      </w:pPr>
+      <w:r>
+        <w:rPr>
+          <w:b/>
+          <w:bCs/>
+        </w:rPr>
+        <w:t>Veille jurisprudentielle :</w:t>
+      </w:r>
+      <w:r>
+        <w:t xml:space="preserve"> Synthétiser les arrêts récents (français et européens) concernant le scraping (ex: jurisprudence sur l'accès aux données publiques) pour définir les "lignes rouges" du projet.</w:t>
+      </w:r>
+    </w:p>
+    <w:p>
+      <w:pPr>
+        <w:numPr>
+          <w:ilvl w:val="0"/>
+          <w:numId w:val="4"/>
+        </w:numPr>
+        <w:spacing w:after="240"/>
+      </w:pPr>
+      <w:r>
+        <w:rPr>
+          <w:b/>
+          <w:bCs/>
+        </w:rPr>
+        <w:t>Livrable :</w:t>
+      </w:r>
+      <w:r>
+        <w:t xml:space="preserve"> Une note de synthèse juridique d'une page pour le rapport d'audit.</w:t>
+      </w:r>
+    </w:p>
+    <w:p>
+      <w:pPr>
+        <w:spacing w:before="240" w:after="240"/>
+        <w:rPr>
+          <w:b/>
+          <w:bCs/>
+        </w:rPr>
+      </w:pPr>
+      <w:r>
+        <w:rPr>
+          <w:b/>
+          <w:bCs/>
+        </w:rPr>
+        <w:t>T0.1.</w:t>
+      </w:r>
+      <w:r>
+        <w:rPr>
+          <w:b/>
+          <w:bCs/>
+        </w:rPr>
+        <w:t>2</w:t>
+      </w:r>
+      <w:r>
+        <w:rPr>
+          <w:b/>
+          <w:bCs/>
+        </w:rPr>
+        <w:t>: Rédaction de la charte éthique du projet</w:t>
+      </w:r>
+    </w:p>
+    <w:p>
+      <w:pPr>
+        <w:numPr>
+          <w:ilvl w:val="0"/>
+          <w:numId w:val="5"/>
+        </w:numPr>
         <w:spacing w:before="240"/>
       </w:pPr>
       <w:r>
@@ -179,187 +282,27 @@
           <w:b/>
           <w:bCs/>
         </w:rPr>
-        <w:t>Recherche sur le RGPD :</w:t>
-      </w:r>
-      <w:r>
-        <w:t xml:space="preserve"> Analyser la distinction entre données publiques d'entreprises (SIREN, CA) et données personnelles (noms de dirigeants, emails directs) pour rester conforme au Règlement Général sur la Protection des Données.</w:t>
-      </w:r>
-    </w:p>
-    <w:p>
-      <w:pPr>
-        <w:numPr>
-          <w:ilvl w:val="0"/>
-          <w:numId w:val="4"/>
-        </w:numPr>
-      </w:pPr>
-      <w:r>
-        <w:rPr>
-          <w:b/>
-          <w:bCs/>
-        </w:rPr>
-        <w:t>Droit d'auteur et droit des bases de données :</w:t>
-      </w:r>
-      <w:r>
-        <w:t xml:space="preserve"> Étudier la notion </w:t>
+        <w:t>Définition de l'identité du robot :</w:t>
+      </w:r>
+      <w:r>
+        <w:t xml:space="preserve"> Rédiger la chaîne de caractère du "User-Agent" qui identifiera votre robot auprès des serveurs (ex: </w:t>
       </w:r>
       <w:proofErr w:type="spellStart"/>
-      <w:r>
-        <w:t>d"extraction</w:t>
-      </w:r>
-      <w:proofErr w:type="spellEnd"/>
-      <w:r>
-        <w:t xml:space="preserve"> substantielle" pour éviter de porter atteinte aux droits de propriété des propriétaires de sites.</w:t>
-      </w:r>
-    </w:p>
-    <w:p>
-      <w:pPr>
-        <w:numPr>
-          <w:ilvl w:val="0"/>
-          <w:numId w:val="4"/>
-        </w:numPr>
-      </w:pPr>
-      <w:r>
-        <w:rPr>
-          <w:b/>
-          <w:bCs/>
-        </w:rPr>
-        <w:t>Veille jurisprudentielle :</w:t>
-      </w:r>
-      <w:r>
-        <w:t xml:space="preserve"> Synthétiser les arrêts récents (français et européens) concernant le </w:t>
-      </w:r>
-      <w:proofErr w:type="spellStart"/>
-      <w:r>
-        <w:t>scraping</w:t>
-      </w:r>
-      <w:proofErr w:type="spellEnd"/>
-      <w:r>
-        <w:t xml:space="preserve"> (</w:t>
-      </w:r>
-      <w:proofErr w:type="gramStart"/>
-      <w:r>
-        <w:t>ex:</w:t>
-      </w:r>
-      <w:proofErr w:type="gramEnd"/>
-      <w:r>
-        <w:t xml:space="preserve"> jurisprudence sur l'accès aux données publiques) pour définir les "lignes rouges" du projet.</w:t>
-      </w:r>
-    </w:p>
-    <w:p>
-      <w:pPr>
-        <w:numPr>
-          <w:ilvl w:val="0"/>
-          <w:numId w:val="4"/>
-        </w:numPr>
-        <w:spacing w:after="240"/>
-      </w:pPr>
-      <w:r>
-        <w:rPr>
-          <w:b/>
-          <w:bCs/>
-        </w:rPr>
-        <w:t>Livrable :</w:t>
-      </w:r>
-      <w:r>
-        <w:t xml:space="preserve"> Une note de synthèse juridique d'une page pour le rapport d'audit.</w:t>
-      </w:r>
-    </w:p>
-    <w:p>
-      <w:pPr>
-        <w:spacing w:before="240" w:after="240"/>
-        <w:rPr>
-          <w:b/>
-          <w:bCs/>
-        </w:rPr>
-      </w:pPr>
-      <w:r>
-        <w:rPr>
-          <w:b/>
-          <w:bCs/>
-        </w:rPr>
-        <w:t>T0.1.2 : Analyse des robots.txt cibles</w:t>
-      </w:r>
-    </w:p>
-    <w:p>
-      <w:pPr>
-        <w:numPr>
-          <w:ilvl w:val="0"/>
-          <w:numId w:val="26"/>
-        </w:numPr>
-        <w:spacing w:before="240"/>
-      </w:pPr>
-      <w:r>
-        <w:rPr>
-          <w:b/>
-          <w:bCs/>
-        </w:rPr>
-        <w:t>Audit technique des URL :</w:t>
-      </w:r>
-      <w:r>
-        <w:t xml:space="preserve"> Accéder au fichier </w:t>
-      </w:r>
       <w:r>
         <w:rPr>
           <w:rFonts w:ascii="Roboto Mono" w:eastAsia="Roboto Mono" w:hAnsi="Roboto Mono" w:cs="Roboto Mono"/>
           <w:color w:val="188038"/>
         </w:rPr>
-        <w:t>/robots.txt</w:t>
-      </w:r>
-      <w:r>
-        <w:t xml:space="preserve"> des sites données par Carine Guillaud.</w:t>
-      </w:r>
-    </w:p>
-    <w:p>
-      <w:pPr>
-        <w:numPr>
-          <w:ilvl w:val="0"/>
-          <w:numId w:val="26"/>
-        </w:numPr>
-      </w:pPr>
-      <w:r>
-        <w:rPr>
-          <w:b/>
-          <w:bCs/>
-        </w:rPr>
-        <w:t>Identification des zones interdites :</w:t>
-      </w:r>
-      <w:r>
-        <w:t xml:space="preserve"> Répertorier les répertoires explicitement interdits au crawl (</w:t>
-      </w:r>
-      <w:proofErr w:type="gramStart"/>
-      <w:r>
-        <w:t>ex:</w:t>
-      </w:r>
-      <w:proofErr w:type="gramEnd"/>
-      <w:r>
-        <w:t xml:space="preserve"> </w:t>
-      </w:r>
+        <w:t>CartoIndustrielleBot</w:t>
+      </w:r>
+      <w:proofErr w:type="spellEnd"/>
       <w:r>
         <w:rPr>
           <w:rFonts w:ascii="Roboto Mono" w:eastAsia="Roboto Mono" w:hAnsi="Roboto Mono" w:cs="Roboto Mono"/>
           <w:color w:val="188038"/>
         </w:rPr>
-        <w:t>/admin</w:t>
-      </w:r>
-      <w:r>
-        <w:t xml:space="preserve">, </w:t>
-      </w:r>
-      <w:r>
-        <w:rPr>
-          <w:rFonts w:ascii="Roboto Mono" w:eastAsia="Roboto Mono" w:hAnsi="Roboto Mono" w:cs="Roboto Mono"/>
-          <w:color w:val="188038"/>
-        </w:rPr>
-        <w:t>/</w:t>
-      </w:r>
-      <w:proofErr w:type="spellStart"/>
-      <w:r>
-        <w:rPr>
-          <w:rFonts w:ascii="Roboto Mono" w:eastAsia="Roboto Mono" w:hAnsi="Roboto Mono" w:cs="Roboto Mono"/>
-          <w:color w:val="188038"/>
-        </w:rPr>
-        <w:t>private</w:t>
-      </w:r>
-      <w:proofErr w:type="spellEnd"/>
+        <w:t>/1.0; +contact</w:t>
+      </w:r>
       <w:r>
         <w:t>).</w:t>
       </w:r>
@@ -368,49 +311,43 @@
       <w:pPr>
         <w:numPr>
           <w:ilvl w:val="0"/>
-          <w:numId w:val="26"/>
-        </w:numPr>
-      </w:pPr>
-      <w:r>
-        <w:rPr>
-          <w:b/>
-          <w:bCs/>
-        </w:rPr>
-        <w:t>Vérification du Crawl-</w:t>
-      </w:r>
-      <w:proofErr w:type="spellStart"/>
-      <w:r>
-        <w:rPr>
-          <w:b/>
-          <w:bCs/>
-        </w:rPr>
-        <w:t>delay</w:t>
-      </w:r>
-      <w:proofErr w:type="spellEnd"/>
-      <w:r>
-        <w:rPr>
-          <w:b/>
-          <w:bCs/>
-        </w:rPr>
-        <w:t xml:space="preserve"> :</w:t>
-      </w:r>
-      <w:r>
-        <w:t xml:space="preserve"> Noter les temps d'attente imposés par les serveurs pour ne pas provoquer d'Attaque par Déni de Service (</w:t>
-      </w:r>
-      <w:proofErr w:type="spellStart"/>
-      <w:r>
-        <w:t>DoS</w:t>
-      </w:r>
-      <w:proofErr w:type="spellEnd"/>
-      <w:r>
-        <w:t>) involontaire.</w:t>
-      </w:r>
-    </w:p>
-    <w:p>
-      <w:pPr>
-        <w:numPr>
-          <w:ilvl w:val="0"/>
-          <w:numId w:val="26"/>
+          <w:numId w:val="5"/>
+        </w:numPr>
+      </w:pPr>
+      <w:r>
+        <w:rPr>
+          <w:b/>
+          <w:bCs/>
+        </w:rPr>
+        <w:t>Engagement de courtoisie :</w:t>
+      </w:r>
+      <w:r>
+        <w:t xml:space="preserve"> Fixer les règles de scraping (ex: ne pas scraper entre 8h et 18h pour ne pas ralentir le site pendant les heures de bureau, limiter à 1 requête par seconde).</w:t>
+      </w:r>
+    </w:p>
+    <w:p>
+      <w:pPr>
+        <w:numPr>
+          <w:ilvl w:val="0"/>
+          <w:numId w:val="5"/>
+        </w:numPr>
+      </w:pPr>
+      <w:r>
+        <w:rPr>
+          <w:b/>
+          <w:bCs/>
+        </w:rPr>
+        <w:t>Politique de conservation des données :</w:t>
+      </w:r>
+      <w:r>
+        <w:t xml:space="preserve"> Définir combien de temps les données brutes (HTML) sont conservées avant d'être transformées ou supprimées.</w:t>
+      </w:r>
+    </w:p>
+    <w:p>
+      <w:pPr>
+        <w:numPr>
+          <w:ilvl w:val="0"/>
+          <w:numId w:val="5"/>
         </w:numPr>
         <w:spacing w:after="240"/>
       </w:pPr>
@@ -422,7 +359,7 @@
         <w:t>Livrable :</w:t>
       </w:r>
       <w:r>
-        <w:t xml:space="preserve"> Tableau récapitulatif des contraintes techniques pour quelques sites cibles.</w:t>
+        <w:t xml:space="preserve"> Document officiel “Charte éthique du projet” signé par l'équipe projet.</w:t>
       </w:r>
     </w:p>
     <w:p>
@@ -438,14 +375,14 @@
           <w:b/>
           <w:bCs/>
         </w:rPr>
-        <w:t>T0.1.3 : Création de la "Liste Blanche" et "Liste Noire"</w:t>
-      </w:r>
-    </w:p>
-    <w:p>
-      <w:pPr>
-        <w:numPr>
-          <w:ilvl w:val="0"/>
-          <w:numId w:val="9"/>
+        <w:t>T0.1.3 liste noire</w:t>
+      </w:r>
+    </w:p>
+    <w:p>
+      <w:pPr>
+        <w:numPr>
+          <w:ilvl w:val="0"/>
+          <w:numId w:val="5"/>
         </w:numPr>
         <w:spacing w:before="240"/>
       </w:pPr>
@@ -454,63 +391,22 @@
           <w:b/>
           <w:bCs/>
         </w:rPr>
-        <w:t>Définition des critères d'éligibilité :</w:t>
-      </w:r>
-      <w:r>
-        <w:t xml:space="preserve"> Établir les règles qui permettent de classer un site en "Liste Blanche" (Open data, accès libre, robots.txt favorable).</w:t>
-      </w:r>
-    </w:p>
-    <w:p>
-      <w:pPr>
-        <w:numPr>
-          <w:ilvl w:val="0"/>
-          <w:numId w:val="9"/>
-        </w:numPr>
-      </w:pPr>
-      <w:r>
-        <w:rPr>
-          <w:b/>
-          <w:bCs/>
-        </w:rPr>
-        <w:t>Identification des sites à exclure :</w:t>
-      </w:r>
-      <w:r>
-        <w:t xml:space="preserve"> Placer en "Liste Noire" les sites demandant une connexion (Login/</w:t>
-      </w:r>
-      <w:proofErr w:type="spellStart"/>
-      <w:r>
-        <w:t>Password</w:t>
-      </w:r>
-      <w:proofErr w:type="spellEnd"/>
-      <w:r>
-        <w:t>), ceux contenant des données sensibles ou ceux interdisant formellement toute extraction automatisée.</w:t>
-      </w:r>
-    </w:p>
-    <w:p>
-      <w:pPr>
-        <w:numPr>
-          <w:ilvl w:val="0"/>
-          <w:numId w:val="9"/>
-        </w:numPr>
-      </w:pPr>
-      <w:r>
-        <w:rPr>
-          <w:b/>
-          <w:bCs/>
-        </w:rPr>
-        <w:t>Validation client :</w:t>
-      </w:r>
-      <w:r>
-        <w:t xml:space="preserve"> Soumettre la liste finale à Carine Guillaud pour s'assurer que les sites exclus ne sont pas critiques pour son besoin.</w:t>
-      </w:r>
-    </w:p>
-    <w:p>
-      <w:pPr>
-        <w:numPr>
-          <w:ilvl w:val="0"/>
-          <w:numId w:val="9"/>
-        </w:numPr>
-        <w:spacing w:after="240"/>
+        <w:t xml:space="preserve">Tenir à jour une liste des sites interdisant le scraping </w:t>
+      </w:r>
+    </w:p>
+    <w:p>
+      <w:pPr>
+        <w:numPr>
+          <w:ilvl w:val="0"/>
+          <w:numId w:val="5"/>
+        </w:numPr>
+        <w:spacing w:after="80"/>
+        <w:rPr>
+          <w:b/>
+          <w:bCs/>
+          <w:sz w:val="34"/>
+          <w:szCs w:val="34"/>
+        </w:rPr>
       </w:pPr>
       <w:r>
         <w:rPr>
@@ -520,157 +416,7 @@
         <w:t>Livrable :</w:t>
       </w:r>
       <w:r>
-        <w:t xml:space="preserve"> Fichier Excel/Google Sheets "Référentiel des cibles" mis à jour.</w:t>
-      </w:r>
-    </w:p>
-    <w:p>
-      <w:pPr>
-        <w:spacing w:before="240" w:after="240"/>
-        <w:rPr>
-          <w:b/>
-          <w:bCs/>
-        </w:rPr>
-      </w:pPr>
-      <w:r>
-        <w:rPr>
-          <w:b/>
-          <w:bCs/>
-        </w:rPr>
-        <w:t>T0.1.4 : Rédaction de la charte éthique du projet</w:t>
-      </w:r>
-    </w:p>
-    <w:p>
-      <w:pPr>
-        <w:numPr>
-          <w:ilvl w:val="0"/>
-          <w:numId w:val="5"/>
-        </w:numPr>
-        <w:spacing w:before="240"/>
-      </w:pPr>
-      <w:r>
-        <w:rPr>
-          <w:b/>
-          <w:bCs/>
-        </w:rPr>
-        <w:lastRenderedPageBreak/>
-        <w:t>Définition de l'identité du robot :</w:t>
-      </w:r>
-      <w:r>
-        <w:t xml:space="preserve"> Rédiger la chaîne de caractère du "User-Agent" qui identifiera votre robot auprès des serveurs (</w:t>
-      </w:r>
-      <w:proofErr w:type="gramStart"/>
-      <w:r>
-        <w:t>ex:</w:t>
-      </w:r>
-      <w:proofErr w:type="gramEnd"/>
-      <w:r>
-        <w:t xml:space="preserve"> </w:t>
-      </w:r>
-      <w:proofErr w:type="spellStart"/>
-      <w:r>
-        <w:rPr>
-          <w:rFonts w:ascii="Roboto Mono" w:eastAsia="Roboto Mono" w:hAnsi="Roboto Mono" w:cs="Roboto Mono"/>
-          <w:color w:val="188038"/>
-        </w:rPr>
-        <w:t>CartoIndustrielleBot</w:t>
-      </w:r>
-      <w:proofErr w:type="spellEnd"/>
-      <w:r>
-        <w:rPr>
-          <w:rFonts w:ascii="Roboto Mono" w:eastAsia="Roboto Mono" w:hAnsi="Roboto Mono" w:cs="Roboto Mono"/>
-          <w:color w:val="188038"/>
-        </w:rPr>
-        <w:t>/1.</w:t>
-      </w:r>
-      <w:proofErr w:type="gramStart"/>
-      <w:r>
-        <w:rPr>
-          <w:rFonts w:ascii="Roboto Mono" w:eastAsia="Roboto Mono" w:hAnsi="Roboto Mono" w:cs="Roboto Mono"/>
-          <w:color w:val="188038"/>
-        </w:rPr>
-        <w:t>0;</w:t>
-      </w:r>
-      <w:proofErr w:type="gramEnd"/>
-      <w:r>
-        <w:rPr>
-          <w:rFonts w:ascii="Roboto Mono" w:eastAsia="Roboto Mono" w:hAnsi="Roboto Mono" w:cs="Roboto Mono"/>
-          <w:color w:val="188038"/>
-        </w:rPr>
-        <w:t xml:space="preserve"> +contact</w:t>
-      </w:r>
-      <w:r>
-        <w:t>).</w:t>
-      </w:r>
-    </w:p>
-    <w:p>
-      <w:pPr>
-        <w:numPr>
-          <w:ilvl w:val="0"/>
-          <w:numId w:val="5"/>
-        </w:numPr>
-      </w:pPr>
-      <w:r>
-        <w:rPr>
-          <w:b/>
-          <w:bCs/>
-        </w:rPr>
-        <w:t>Engagement de courtoisie :</w:t>
-      </w:r>
-      <w:r>
-        <w:t xml:space="preserve"> Fixer les règles de </w:t>
-      </w:r>
-      <w:proofErr w:type="spellStart"/>
-      <w:r>
-        <w:t>scraping</w:t>
-      </w:r>
-      <w:proofErr w:type="spellEnd"/>
-      <w:r>
-        <w:t xml:space="preserve"> (</w:t>
-      </w:r>
-      <w:proofErr w:type="gramStart"/>
-      <w:r>
-        <w:t>ex:</w:t>
-      </w:r>
-      <w:proofErr w:type="gramEnd"/>
-      <w:r>
-        <w:t xml:space="preserve"> ne pas scraper entre 8h et 18h pour ne pas ralentir le site pendant les heures de bureau, limiter à 1 requête par seconde).</w:t>
-      </w:r>
-    </w:p>
-    <w:p>
-      <w:pPr>
-        <w:numPr>
-          <w:ilvl w:val="0"/>
-          <w:numId w:val="5"/>
-        </w:numPr>
-      </w:pPr>
-      <w:r>
-        <w:rPr>
-          <w:b/>
-          <w:bCs/>
-        </w:rPr>
-        <w:t>Politique de conservation des données :</w:t>
-      </w:r>
-      <w:r>
-        <w:t xml:space="preserve"> Définir combien de temps les données brutes (HTML) sont conservées avant d'être transformées ou supprimées.</w:t>
-      </w:r>
-    </w:p>
-    <w:p>
-      <w:pPr>
-        <w:numPr>
-          <w:ilvl w:val="0"/>
-          <w:numId w:val="5"/>
-        </w:numPr>
-        <w:spacing w:after="240"/>
-      </w:pPr>
-      <w:r>
-        <w:rPr>
-          <w:b/>
-          <w:bCs/>
-        </w:rPr>
-        <w:t>Livrable :</w:t>
-      </w:r>
-      <w:r>
-        <w:t xml:space="preserve"> Document officiel “Charte éthique du projet” signé par l'équipe projet.</w:t>
+        <w:t xml:space="preserve"> Tableau</w:t>
       </w:r>
     </w:p>
     <w:p>
@@ -782,14 +528,6 @@
       <w:pPr>
         <w:spacing w:after="80"/>
       </w:pPr>
-      <w:r>
-        <w:t>L'objectif de cette phase est de s'assurer que l'infrastructure matérielle et logicielle est prête à supporter l'IA locale et le flux de données.</w:t>
-      </w:r>
-    </w:p>
-    <w:p>
-      <w:pPr>
-        <w:spacing w:after="80"/>
-      </w:pPr>
     </w:p>
     <w:p>
       <w:pPr>
@@ -804,14 +542,28 @@
           <w:b/>
           <w:bCs/>
         </w:rPr>
-        <w:t>T1.1.1 : Audit des capacités machine</w:t>
-      </w:r>
-    </w:p>
-    <w:p>
-      <w:pPr>
-        <w:numPr>
-          <w:ilvl w:val="0"/>
-          <w:numId w:val="14"/>
+        <w:t>T1.1.</w:t>
+      </w:r>
+      <w:r>
+        <w:rPr>
+          <w:b/>
+          <w:bCs/>
+        </w:rPr>
+        <w:t>1</w:t>
+      </w:r>
+      <w:r>
+        <w:rPr>
+          <w:b/>
+          <w:bCs/>
+        </w:rPr>
+        <w:t xml:space="preserve"> : Architecture de Versioning (GitHub)</w:t>
+      </w:r>
+    </w:p>
+    <w:p>
+      <w:pPr>
+        <w:numPr>
+          <w:ilvl w:val="0"/>
+          <w:numId w:val="13"/>
         </w:numPr>
         <w:spacing w:before="240"/>
       </w:pPr>
@@ -820,89 +572,10 @@
           <w:b/>
           <w:bCs/>
         </w:rPr>
-        <w:t>Inventaire du matériel :</w:t>
-      </w:r>
-      <w:r>
-        <w:t xml:space="preserve"> Vérifier la RAM (16 Go minimum recommandés) et la puissance processeur des ordinateurs des membres travaillant sur l’IA</w:t>
-      </w:r>
-    </w:p>
-    <w:p>
-      <w:pPr>
-        <w:numPr>
-          <w:ilvl w:val="0"/>
-          <w:numId w:val="14"/>
-        </w:numPr>
-      </w:pPr>
-      <w:r>
-        <w:rPr>
-          <w:b/>
-          <w:bCs/>
-        </w:rPr>
-        <w:t>Vérification de l'accélération GPU :</w:t>
-      </w:r>
-      <w:r>
-        <w:t xml:space="preserve"> Identifier les machines possédant des cartes graphiques (NVIDIA/Apple Silicon) pour accélérer l'IA locale (</w:t>
-      </w:r>
-      <w:proofErr w:type="spellStart"/>
-      <w:r>
-        <w:t>Ollama</w:t>
-      </w:r>
-      <w:proofErr w:type="spellEnd"/>
-      <w:r>
-        <w:t>).</w:t>
-      </w:r>
-    </w:p>
-    <w:p>
-      <w:pPr>
-        <w:numPr>
-          <w:ilvl w:val="0"/>
-          <w:numId w:val="14"/>
-        </w:numPr>
-      </w:pPr>
-      <w:r>
-        <w:rPr>
-          <w:b/>
-          <w:bCs/>
-        </w:rPr>
-        <w:t>Diagnostic de l'espace disque :</w:t>
-      </w:r>
-      <w:r>
-        <w:t xml:space="preserve"> S'assurer d'un espace suffisant pour stocker les modèles LLM (environ 5 à 10 Go par modèle) et les bases de données temporaires.</w:t>
-      </w:r>
-    </w:p>
-    <w:p>
-      <w:pPr>
-        <w:numPr>
-          <w:ilvl w:val="0"/>
-          <w:numId w:val="14"/>
-        </w:numPr>
-        <w:spacing w:after="240"/>
-      </w:pPr>
-      <w:r>
-        <w:rPr>
-          <w:b/>
-          <w:bCs/>
-        </w:rPr>
-        <w:t>Livrable :</w:t>
-      </w:r>
-      <w:r>
-        <w:t xml:space="preserve"> Fiche de diagnostic matériel de l'équipe et préconisations d'optimisation.</w:t>
-      </w:r>
-    </w:p>
-    <w:p>
-      <w:pPr>
-        <w:spacing w:before="240" w:after="240"/>
-        <w:rPr>
-          <w:b/>
-          <w:bCs/>
-        </w:rPr>
-      </w:pPr>
-      <w:r>
-        <w:rPr>
-          <w:b/>
-          <w:bCs/>
-        </w:rPr>
-        <w:t>T1.1.2 : Architecture de Versioning (GitHub)</w:t>
+        <w:t>Initialisation du dépôt :</w:t>
+      </w:r>
+      <w:r>
+        <w:t xml:space="preserve"> Création du repository GitHub centralisé et invitation des 8 membres.</w:t>
       </w:r>
     </w:p>
     <w:p>
@@ -911,31 +584,13 @@
           <w:ilvl w:val="0"/>
           <w:numId w:val="13"/>
         </w:numPr>
-        <w:spacing w:before="240"/>
-      </w:pPr>
-      <w:r>
-        <w:rPr>
-          <w:b/>
-          <w:bCs/>
-        </w:rPr>
-        <w:t>Initialisation du dépôt :</w:t>
-      </w:r>
-      <w:r>
-        <w:t xml:space="preserve"> Création du repository GitHub centralisé et invitation des 8 membres.</w:t>
-      </w:r>
-    </w:p>
-    <w:p>
-      <w:pPr>
-        <w:numPr>
-          <w:ilvl w:val="0"/>
-          <w:numId w:val="13"/>
-        </w:numPr>
-      </w:pPr>
-      <w:r>
-        <w:rPr>
-          <w:b/>
-          <w:bCs/>
-        </w:rPr>
+      </w:pPr>
+      <w:r>
+        <w:rPr>
+          <w:b/>
+          <w:bCs/>
+        </w:rPr>
+        <w:lastRenderedPageBreak/>
         <w:t>Définition de la stratégie de branches :</w:t>
       </w:r>
       <w:r>
@@ -1005,15 +660,7 @@
           <w:b/>
           <w:bCs/>
         </w:rPr>
-        <w:t xml:space="preserve">Configuration </w:t>
-      </w:r>
-      <w:proofErr w:type="gramStart"/>
-      <w:r>
-        <w:rPr>
-          <w:b/>
-          <w:bCs/>
-        </w:rPr>
-        <w:t xml:space="preserve">du </w:t>
+        <w:t xml:space="preserve">Configuration du </w:t>
       </w:r>
       <w:r>
         <w:rPr>
@@ -1035,7 +682,6 @@
         <w:t>gitignore</w:t>
       </w:r>
       <w:proofErr w:type="spellEnd"/>
-      <w:proofErr w:type="gramEnd"/>
       <w:r>
         <w:rPr>
           <w:b/>
@@ -1108,17 +754,22 @@
           <w:b/>
           <w:bCs/>
         </w:rPr>
-        <w:t xml:space="preserve">T1.1.3 : Benchmark des bibliothèques de </w:t>
-      </w:r>
-      <w:proofErr w:type="spellStart"/>
-      <w:r>
-        <w:rPr>
-          <w:b/>
-          <w:bCs/>
-        </w:rPr>
-        <w:t>Scraping</w:t>
-      </w:r>
-      <w:proofErr w:type="spellEnd"/>
+        <w:t>T1.1.</w:t>
+      </w:r>
+      <w:r>
+        <w:rPr>
+          <w:b/>
+          <w:bCs/>
+        </w:rPr>
+        <w:t>2</w:t>
+      </w:r>
+      <w:r>
+        <w:rPr>
+          <w:b/>
+          <w:bCs/>
+        </w:rPr>
+        <w:t xml:space="preserve"> : Benchmark des bibliothèques de Scraping</w:t>
+      </w:r>
     </w:p>
     <w:p>
       <w:pPr>
@@ -1190,15 +841,7 @@
         <w:t>Évaluation de la gestion du JavaScript :</w:t>
       </w:r>
       <w:r>
-        <w:t xml:space="preserve"> Tester la capacité des bibliothèques à charger des sites complexes (</w:t>
-      </w:r>
-      <w:proofErr w:type="spellStart"/>
-      <w:r>
-        <w:t>Infinite</w:t>
-      </w:r>
-      <w:proofErr w:type="spellEnd"/>
-      <w:r>
-        <w:t xml:space="preserve"> scroll, boutons cliquables).</w:t>
+        <w:t xml:space="preserve"> Tester la capacité des bibliothèques à charger des sites complexes (Infinite scroll, boutons cliquables).</w:t>
       </w:r>
     </w:p>
     <w:p>
@@ -1251,7 +894,6 @@
           <w:b/>
           <w:bCs/>
         </w:rPr>
-        <w:lastRenderedPageBreak/>
         <w:t>T1.1.4 : Déploiement de la base SQL locale</w:t>
       </w:r>
     </w:p>
@@ -1271,7 +913,7 @@
         <w:t>Choix du moteur :</w:t>
       </w:r>
       <w:r>
-        <w:t xml:space="preserve"> Installation de SQLite (léger pour le dev) ou PostgreSQL (robuste pour le stockage final).</w:t>
+        <w:t xml:space="preserve"> Installation de SQLite  </w:t>
       </w:r>
     </w:p>
     <w:p>
@@ -1360,21 +1002,6 @@
           <w:ilvl w:val="0"/>
           <w:numId w:val="6"/>
         </w:numPr>
-        <w:spacing w:after="240"/>
-      </w:pPr>
-      <w:r>
-        <w:rPr>
-          <w:b/>
-          <w:bCs/>
-        </w:rPr>
-        <w:t>Livrable :</w:t>
-      </w:r>
-      <w:r>
-        <w:t xml:space="preserve"> Base de données fonctionnelle avec un premier jeu de données de test inséré.</w:t>
-      </w:r>
-    </w:p>
-    <w:p>
-      <w:pPr>
         <w:spacing w:after="80"/>
         <w:rPr>
           <w:b/>
@@ -1383,6 +1010,16 @@
           <w:szCs w:val="34"/>
         </w:rPr>
       </w:pPr>
+      <w:r>
+        <w:rPr>
+          <w:b/>
+          <w:bCs/>
+        </w:rPr>
+        <w:t>Livrable :</w:t>
+      </w:r>
+      <w:r>
+        <w:t xml:space="preserve"> Base de données </w:t>
+      </w:r>
     </w:p>
     <w:tbl>
       <w:tblPr>
@@ -1647,6 +1284,7 @@
           <w:sz w:val="22"/>
           <w:szCs w:val="22"/>
         </w:rPr>
+        <w:lastRenderedPageBreak/>
         <w:t xml:space="preserve">T2.1 : Sélection du modèle/provider pour </w:t>
       </w:r>
       <w:proofErr w:type="spellStart"/>
@@ -1678,23 +1316,51 @@
         <w:t>T2.1.1 Veille et présélection des modèles :</w:t>
       </w:r>
       <w:r>
-        <w:t xml:space="preserve"> Identifier les modèles open-source adaptés à l'extraction (</w:t>
-      </w:r>
-      <w:proofErr w:type="gramStart"/>
-      <w:r>
-        <w:t>ex:</w:t>
-      </w:r>
-      <w:proofErr w:type="gramEnd"/>
-      <w:r>
-        <w:t xml:space="preserve"> </w:t>
+        <w:t xml:space="preserve"> Identifier les modèles open-source adaptés à l'extraction (ex: Llama 3, Mistral v0.3, Phi-3). Prioriser les modèles réputés pour leur logique et leur respect des formats.</w:t>
+      </w:r>
+    </w:p>
+    <w:p>
+      <w:pPr>
+        <w:numPr>
+          <w:ilvl w:val="0"/>
+          <w:numId w:val="18"/>
+        </w:numPr>
+      </w:pPr>
+      <w:r>
+        <w:rPr>
+          <w:b/>
+          <w:bCs/>
+        </w:rPr>
+        <w:t>T2.1.2 Test de compatibilité matérielle :</w:t>
+      </w:r>
+      <w:r>
+        <w:t xml:space="preserve"> Charger les modèles sur les PC de l'équipe pour vérifier s'ils tournent sans crash (consommation RAM/VRAM).</w:t>
+      </w:r>
+    </w:p>
+    <w:p>
+      <w:pPr>
+        <w:numPr>
+          <w:ilvl w:val="0"/>
+          <w:numId w:val="18"/>
+        </w:numPr>
+      </w:pPr>
+      <w:r>
+        <w:rPr>
+          <w:b/>
+          <w:bCs/>
+        </w:rPr>
+        <w:t>T2.1.3 Benchmark de performance :</w:t>
+      </w:r>
+      <w:r>
+        <w:t xml:space="preserve"> Mesurer la vitesse de génération (</w:t>
       </w:r>
       <w:proofErr w:type="spellStart"/>
       <w:r>
-        <w:t>Llama</w:t>
+        <w:t>tokens</w:t>
       </w:r>
       <w:proofErr w:type="spellEnd"/>
       <w:r>
-        <w:t xml:space="preserve"> 3, Mistral v0.3, Phi-3). Prioriser les modèles réputés pour leur logique et leur respect des formats.</w:t>
+        <w:t xml:space="preserve"> par seconde) et le temps de latence total pour traiter une page HTML type.</w:t>
       </w:r>
     </w:p>
     <w:p>
@@ -1709,10 +1375,10 @@
           <w:b/>
           <w:bCs/>
         </w:rPr>
-        <w:t>T2.1.2 Test de compatibilité matérielle :</w:t>
-      </w:r>
-      <w:r>
-        <w:t xml:space="preserve"> Charger les modèles sur les PC de l'équipe pour vérifier s'ils tournent sans crash (consommation RAM/VRAM).</w:t>
+        <w:t>T2.1.4 Évaluation "Zero-Shot" :</w:t>
+      </w:r>
+      <w:r>
+        <w:t xml:space="preserve"> Tester la capacité de l'IA à extraire les données correctement du premier coup, sans lui donner d'exemples préalables.</w:t>
       </w:r>
     </w:p>
     <w:p>
@@ -1727,18 +1393,10 @@
           <w:b/>
           <w:bCs/>
         </w:rPr>
-        <w:t>T2.1.3 Benchmark de performance :</w:t>
-      </w:r>
-      <w:r>
-        <w:t xml:space="preserve"> Mesurer la vitesse de génération (</w:t>
-      </w:r>
-      <w:proofErr w:type="spellStart"/>
-      <w:r>
-        <w:t>tokens</w:t>
-      </w:r>
-      <w:proofErr w:type="spellEnd"/>
-      <w:r>
-        <w:t xml:space="preserve"> par seconde) et le temps de latence total pour traiter une page HTML type.</w:t>
+        <w:t>T2.1.5 Analyse Précision/Poids :</w:t>
+      </w:r>
+      <w:r>
+        <w:t xml:space="preserve"> Comparer les versions "quantifiées" (compressées, ex: 4-bit vs 8-bit). Est-ce qu'un modèle plus léger perd trop en précision ?</w:t>
       </w:r>
     </w:p>
     <w:p>
@@ -1747,67 +1405,6 @@
           <w:ilvl w:val="0"/>
           <w:numId w:val="18"/>
         </w:numPr>
-      </w:pPr>
-      <w:r>
-        <w:rPr>
-          <w:b/>
-          <w:bCs/>
-        </w:rPr>
-        <w:t>T2.1.4 Évaluation "</w:t>
-      </w:r>
-      <w:proofErr w:type="spellStart"/>
-      <w:r>
-        <w:rPr>
-          <w:b/>
-          <w:bCs/>
-        </w:rPr>
-        <w:t>Zero</w:t>
-      </w:r>
-      <w:proofErr w:type="spellEnd"/>
-      <w:r>
-        <w:rPr>
-          <w:b/>
-          <w:bCs/>
-        </w:rPr>
-        <w:t>-Shot" :</w:t>
-      </w:r>
-      <w:r>
-        <w:t xml:space="preserve"> Tester la capacité de l'IA à extraire les données correctement du premier coup, sans lui donner d'exemples préalables.</w:t>
-      </w:r>
-    </w:p>
-    <w:p>
-      <w:pPr>
-        <w:numPr>
-          <w:ilvl w:val="0"/>
-          <w:numId w:val="18"/>
-        </w:numPr>
-      </w:pPr>
-      <w:r>
-        <w:rPr>
-          <w:b/>
-          <w:bCs/>
-        </w:rPr>
-        <w:lastRenderedPageBreak/>
-        <w:t>T2.1.5 Analyse Précision/Poids :</w:t>
-      </w:r>
-      <w:r>
-        <w:t xml:space="preserve"> Comparer les versions "quantifiées" (compressées, </w:t>
-      </w:r>
-      <w:proofErr w:type="gramStart"/>
-      <w:r>
-        <w:t>ex:</w:t>
-      </w:r>
-      <w:proofErr w:type="gramEnd"/>
-      <w:r>
-        <w:t xml:space="preserve"> 4-bit vs 8-bit). Est-ce qu'un modèle plus léger perd trop en précision ?</w:t>
-      </w:r>
-    </w:p>
-    <w:p>
-      <w:pPr>
-        <w:numPr>
-          <w:ilvl w:val="0"/>
-          <w:numId w:val="18"/>
-        </w:numPr>
         <w:spacing w:after="240"/>
       </w:pPr>
       <w:r>
@@ -1818,15 +1415,7 @@
         <w:t>T2.1.6 Note de choix technique :</w:t>
       </w:r>
       <w:r>
-        <w:t xml:space="preserve"> Rédiger un document justifiant le choix du modèle final (</w:t>
-      </w:r>
-      <w:proofErr w:type="gramStart"/>
-      <w:r>
-        <w:t>ex:</w:t>
-      </w:r>
-      <w:proofErr w:type="gramEnd"/>
-      <w:r>
-        <w:t xml:space="preserve"> "Mistral 7B retenu pour son rapport vitesse/précision").</w:t>
+        <w:t xml:space="preserve"> Rédiger un document justifiant le choix du modèle final (ex: "Mistral 7B retenu pour son rapport vitesse/précision").</w:t>
       </w:r>
     </w:p>
     <w:p>
@@ -1970,15 +1559,7 @@
         <w:t>T2.2.2 Dictionnaire des contraintes :</w:t>
       </w:r>
       <w:r>
-        <w:t xml:space="preserve"> Définir le format de chaque champ (</w:t>
-      </w:r>
-      <w:proofErr w:type="gramStart"/>
-      <w:r>
-        <w:t>ex:</w:t>
-      </w:r>
-      <w:proofErr w:type="gramEnd"/>
-      <w:r>
-        <w:t xml:space="preserve"> "Le SIREN doit être une chaîne de 9 chiffres", "Le CA doit être un nombre décimal").</w:t>
+        <w:t xml:space="preserve"> Définir le format de chaque champ (ex: "Le SIREN doit être une chaîne de 9 chiffres", "Le CA doit être un nombre décimal").</w:t>
       </w:r>
     </w:p>
     <w:p>
@@ -1997,15 +1578,7 @@
         <w:t>T2.2.3 Modélisation JSON :</w:t>
       </w:r>
       <w:r>
-        <w:t xml:space="preserve"> Créer le schéma technique (JSON </w:t>
-      </w:r>
-      <w:proofErr w:type="spellStart"/>
-      <w:r>
-        <w:t>Schema</w:t>
-      </w:r>
-      <w:proofErr w:type="spellEnd"/>
-      <w:r>
-        <w:t>) que l'IA devra impérativement suivre pour que le robot puisse lire sa réponse.</w:t>
+        <w:t xml:space="preserve"> Créer le schéma technique (JSON Schema) que l'IA devra impérativement suivre pour que le robot puisse lire sa réponse.</w:t>
       </w:r>
     </w:p>
     <w:p>
@@ -2107,6 +1680,7 @@
           <w:b/>
           <w:bCs/>
         </w:rPr>
+        <w:lastRenderedPageBreak/>
         <w:t>T2.3.3 Anonymisation et Sécurité :</w:t>
       </w:r>
       <w:r>
@@ -2240,15 +1814,7 @@
         <w:t xml:space="preserve"> :</w:t>
       </w:r>
       <w:r>
-        <w:t xml:space="preserve"> Tester différentes instructions (prompts) pour trouver celle qui donne les meilleurs résultats (</w:t>
-      </w:r>
-      <w:proofErr w:type="gramStart"/>
-      <w:r>
-        <w:t>ex:</w:t>
-      </w:r>
-      <w:proofErr w:type="gramEnd"/>
-      <w:r>
-        <w:t xml:space="preserve"> "Réponds uniquement en JSON", "Pense étape par étape").</w:t>
+        <w:t xml:space="preserve"> Tester différentes instructions (prompts) pour trouver celle qui donne les meilleurs résultats (ex: "Réponds uniquement en JSON", "Pense étape par étape").</w:t>
       </w:r>
     </w:p>
     <w:p>
@@ -2264,7 +1830,6 @@
           <w:b/>
           <w:bCs/>
         </w:rPr>
-        <w:lastRenderedPageBreak/>
         <w:t>T2.4.3 Gestion de la fenêtre de contexte :</w:t>
       </w:r>
       <w:r>
@@ -2462,15 +2027,7 @@
         <w:t>T2.6.3 Interrogation de la base de données en langage naturel</w:t>
       </w:r>
       <w:r>
-        <w:t xml:space="preserve"> : Développer la fonctionnalité de Q&amp;A qui permet à l'utilisateur de poser des questions en français sur les données collectées (</w:t>
-      </w:r>
-      <w:proofErr w:type="gramStart"/>
-      <w:r>
-        <w:t>ex:</w:t>
-      </w:r>
-      <w:proofErr w:type="gramEnd"/>
-      <w:r>
-        <w:t xml:space="preserve"> « quelles sont les entreprises du secteur automobile avec un CA &gt; 10M€ ? », « combien d'entreprises ont été scrapées cette semaine ? »). L'IA traduit la question en requête SQL, l'exécute et reformule la réponse.</w:t>
+        <w:t xml:space="preserve"> : Développer la fonctionnalité de Q&amp;A qui permet à l'utilisateur de poser des questions en français sur les données collectées (ex: « quelles sont les entreprises du secteur automobile avec un CA &gt; 10M€ ? », « combien d'entreprises ont été scrapées cette semaine ? »). L'IA traduit la question en requête SQL, l'exécute et reformule la réponse.</w:t>
       </w:r>
     </w:p>
     <w:p>
@@ -2505,6 +2062,7 @@
           <w:b/>
           <w:bCs/>
         </w:rPr>
+        <w:lastRenderedPageBreak/>
         <w:t>T2.6.5 Module de reformulation et d'explication</w:t>
       </w:r>
       <w:r>
@@ -2636,20 +2194,8 @@
           <w:sz w:val="22"/>
           <w:szCs w:val="22"/>
         </w:rPr>
-        <w:t xml:space="preserve">T3.0 : [FORMATION] </w:t>
-      </w:r>
-      <w:proofErr w:type="spellStart"/>
-      <w:r>
-        <w:rPr>
-          <w:b/>
-          <w:bCs/>
-          <w:color w:val="000000"/>
-          <w:sz w:val="22"/>
-          <w:szCs w:val="22"/>
-        </w:rPr>
-        <w:t>Scraping</w:t>
-      </w:r>
-      <w:proofErr w:type="spellEnd"/>
+        <w:t>T3.0 : [FORMATION] Scraping</w:t>
+      </w:r>
     </w:p>
     <w:p>
       <w:pPr>
@@ -2664,24 +2210,7 @@
           <w:b/>
           <w:bCs/>
         </w:rPr>
-        <w:lastRenderedPageBreak/>
-        <w:t xml:space="preserve">T3.0.1 Formation </w:t>
-      </w:r>
-      <w:proofErr w:type="spellStart"/>
-      <w:r>
-        <w:rPr>
-          <w:b/>
-          <w:bCs/>
-        </w:rPr>
-        <w:t>Scraping</w:t>
-      </w:r>
-      <w:proofErr w:type="spellEnd"/>
-      <w:r>
-        <w:rPr>
-          <w:b/>
-          <w:bCs/>
-        </w:rPr>
-        <w:t xml:space="preserve"> :</w:t>
+        <w:t>T3.0.1 Formation Scraping :</w:t>
       </w:r>
       <w:r>
         <w:t xml:space="preserve"> Apprentissage de la manipulation du DOM (Document Object Model), maîtrise des sélecteurs CSS et XPath, et découverte des bibliothèques Python (</w:t>
@@ -2996,15 +2525,7 @@
         </w:numPr>
       </w:pPr>
       <w:r>
-        <w:t>Créer un système de "signature" de la page (</w:t>
-      </w:r>
-      <w:proofErr w:type="gramStart"/>
-      <w:r>
-        <w:t>ex:</w:t>
-      </w:r>
-      <w:proofErr w:type="gramEnd"/>
-      <w:r>
-        <w:t xml:space="preserve"> nombre de balises </w:t>
+        <w:t xml:space="preserve">Créer un système de "signature" de la page (ex: nombre de balises </w:t>
       </w:r>
       <w:r>
         <w:rPr>
@@ -3025,6 +2546,7 @@
         </w:numPr>
       </w:pPr>
       <w:r>
+        <w:lastRenderedPageBreak/>
         <w:t>Comparer la structure actuelle avec la structure connue lors de la dernière visite réussie.</w:t>
       </w:r>
     </w:p>
@@ -3340,6 +2862,7 @@
           <w:b/>
           <w:bCs/>
         </w:rPr>
+        <w:lastRenderedPageBreak/>
         <w:t>T4.2.3 Module de test automatique : Après modification du code, le système exécute automatiquement le nouveau code sur un échantillon de test pour vérifier qu'il fonctionne et que les données extraites sont correctes.</w:t>
       </w:r>
       <w:r>
@@ -3389,7 +2912,6 @@
           <w:sz w:val="22"/>
           <w:szCs w:val="22"/>
         </w:rPr>
-        <w:lastRenderedPageBreak/>
         <w:t>T4.3 : Module d'ajout de sources et de données</w:t>
       </w:r>
     </w:p>
@@ -3427,15 +2949,7 @@
         <w:t>T4.3.2 Ajout de nouveaux champs de données : L'utilisateur peut demander à collecter un nouveau champ (ex: « ajoute le numéro de TVA ») via un prompt. L'IA adapte le schéma de la base de données, modifie le scraper et met à jour le dashboard Power BI automatiquement.</w:t>
       </w:r>
       <w:r>
-        <w:t xml:space="preserve"> Convertir les données dans le bon type (</w:t>
-      </w:r>
-      <w:proofErr w:type="gramStart"/>
-      <w:r>
-        <w:t>ex:</w:t>
-      </w:r>
-      <w:proofErr w:type="gramEnd"/>
-      <w:r>
-        <w:t xml:space="preserve"> transformer "1.2M €" en </w:t>
+        <w:t xml:space="preserve"> Convertir les données dans le bon type (ex: transformer "1.2M €" en </w:t>
       </w:r>
       <w:r>
         <w:rPr>
@@ -3486,15 +3000,7 @@
         <w:t>T4.3.3 Validation et confirmation : Après chaque modification, le système présente un résumé des changements effectués à l'utilisateur et demande confirmation avant de les appliquer définitivement.</w:t>
       </w:r>
       <w:r>
-        <w:t xml:space="preserve"> Mettre en place les tests de cohérence (</w:t>
-      </w:r>
-      <w:proofErr w:type="gramStart"/>
-      <w:r>
-        <w:t>ex:</w:t>
-      </w:r>
-      <w:proofErr w:type="gramEnd"/>
-      <w:r>
-        <w:t xml:space="preserve"> vérifier qu'un SIREN fait bien 9 chiffres) et supprimer les doublons avant l'envoi final vers la base de données.</w:t>
+        <w:t xml:space="preserve"> Mettre en place les tests de cohérence (ex: vérifier qu'un SIREN fait bien 9 chiffres) et supprimer les doublons avant l'envoi final vers la base de données.</w:t>
       </w:r>
     </w:p>
     <w:p>
@@ -3534,6 +3040,7 @@
     </w:p>
     <w:p>
       <w:r>
+        <w:lastRenderedPageBreak/>
         <w:t>T4.5.3 Gestion des erreurs et feedback : Si l'IA ne comprend pas la demande ou ne peut pas l'exécuter, elle explique pourquoi et propose des alternatives. Toutes les actions sont loggées pour permettre un suivi.</w:t>
       </w:r>
     </w:p>
@@ -3554,7 +3061,6 @@
     </w:p>
     <w:p>
       <w:r>
-        <w:lastRenderedPageBreak/>
         <w:t>T4.6.3 Dédoublonnage et Intégrité : Mettre en place les tests de cohérence (ex: vérifier qu'un SIREN fait 9 chiffres, qu'un email contient un @, qu'il n'y a pas de doublons sur le couple SIREN + nom).</w:t>
       </w:r>
     </w:p>
@@ -3786,15 +3292,7 @@
       </w:r>
       <w:proofErr w:type="spellEnd"/>
       <w:r>
-        <w:t xml:space="preserve"> (</w:t>
-      </w:r>
-      <w:proofErr w:type="gramStart"/>
-      <w:r>
-        <w:t>ex:</w:t>
-      </w:r>
-      <w:proofErr w:type="gramEnd"/>
-      <w:r>
-        <w:t xml:space="preserve"> une page "Vue Globale", une page "Détails par Entreprise", une page "Analyse Sectorielle").</w:t>
+        <w:t xml:space="preserve"> (ex: une page "Vue Globale", une page "Détails par Entreprise", une page "Analyse Sectorielle").</w:t>
       </w:r>
     </w:p>
     <w:p>
@@ -3827,23 +3325,7 @@
           <w:b/>
           <w:bCs/>
         </w:rPr>
-        <w:t xml:space="preserve">T5.2.3 Connexion données (Power </w:t>
-      </w:r>
-      <w:proofErr w:type="spellStart"/>
-      <w:r>
-        <w:rPr>
-          <w:b/>
-          <w:bCs/>
-        </w:rPr>
-        <w:t>Query</w:t>
-      </w:r>
-      <w:proofErr w:type="spellEnd"/>
-      <w:r>
-        <w:rPr>
-          <w:b/>
-          <w:bCs/>
-        </w:rPr>
-        <w:t>) :</w:t>
+        <w:t>T5.2.3 Connexion données (Power Query) :</w:t>
       </w:r>
       <w:r>
         <w:t xml:space="preserve"> Configurer le lien automatique entre votre base SQL (ou fichiers CSV) et Power BI. Nettoyer les données à l'import (ETL).</w:t>
@@ -3864,15 +3346,7 @@
         <w:t>T5.2.4 Écriture des formules DAX :</w:t>
       </w:r>
       <w:r>
-        <w:t xml:space="preserve"> Créer des indicateurs calculés complexes (</w:t>
-      </w:r>
-      <w:proofErr w:type="gramStart"/>
-      <w:r>
-        <w:t>ex:</w:t>
-      </w:r>
-      <w:proofErr w:type="gramEnd"/>
-      <w:r>
-        <w:t xml:space="preserve"> "Taux de croissance moyen", "Indice de complétude des données", "Répartition géographique").</w:t>
+        <w:t xml:space="preserve"> Créer des indicateurs calculés complexes (ex: "Taux de croissance moyen", "Indice de complétude des données", "Répartition géographique").</w:t>
       </w:r>
     </w:p>
     <w:p>
@@ -3960,6 +3434,7 @@
           <w:b/>
           <w:bCs/>
         </w:rPr>
+        <w:lastRenderedPageBreak/>
         <w:t xml:space="preserve">T5.3.2 Développement de la page </w:t>
       </w:r>
       <w:proofErr w:type="spellStart"/>
@@ -4059,7 +3534,6 @@
           <w:b/>
           <w:bCs/>
         </w:rPr>
-        <w:lastRenderedPageBreak/>
         <w:t>T5.4.1 Écriture du script principal :</w:t>
       </w:r>
       <w:r>
@@ -4136,15 +3610,7 @@
         <w:t>T5.4.4 Planification des exécutions :</w:t>
       </w:r>
       <w:r>
-        <w:t xml:space="preserve"> Automatiser le lancement du script (</w:t>
-      </w:r>
-      <w:proofErr w:type="gramStart"/>
-      <w:r>
-        <w:t>ex:</w:t>
-      </w:r>
-      <w:proofErr w:type="gramEnd"/>
-      <w:r>
-        <w:t xml:space="preserve"> tous les lundis matin) sans intervention manuelle.</w:t>
+        <w:t xml:space="preserve"> Automatiser le lancement du script (ex: tous les lundis matin) sans intervention manuelle.</w:t>
       </w:r>
     </w:p>
     <w:p>
@@ -4190,15 +3656,7 @@
         <w:t>T5.5.1 Simulation complète :</w:t>
       </w:r>
       <w:r>
-        <w:t xml:space="preserve"> Lancer le pipeline sur un large échantillon (</w:t>
-      </w:r>
-      <w:proofErr w:type="gramStart"/>
-      <w:r>
-        <w:t>ex:</w:t>
-      </w:r>
-      <w:proofErr w:type="gramEnd"/>
-      <w:r>
-        <w:t xml:space="preserve"> 100 sites) pour vérifier la stabilité sur la durée.</w:t>
+        <w:t xml:space="preserve"> Lancer le pipeline sur un large échantillon (ex: 100 sites) pour vérifier la stabilité sur la durée.</w:t>
       </w:r>
     </w:p>
     <w:p>

</xml_diff>